<commit_message>
content: restore weekdays in jinyun guide (no hotel exposed); keep xi-an weekdays stripped (location exposed)
</commit_message>
<xml_diff>
--- a/trip/jinyun-xiandu/jinyun-xiandu.docx
+++ b/trip/jinyun-xiandu/jinyun-xiandu.docx
@@ -108,7 +108,7 @@
           <w:b/>
           <w:sz w:val="24"/>
         </w:rPr>
-        <w:t>D1（5月xx日）出发</w:t>
+        <w:t>D1（5月xx日 周五）出发</w:t>
       </w:r>
     </w:p>
     <w:p>
@@ -149,7 +149,7 @@
           <w:b/>
           <w:sz w:val="24"/>
         </w:rPr>
-        <w:t>D2（5月xx日）</w:t>
+        <w:t>D2（5月xx日 周六）</w:t>
       </w:r>
     </w:p>
     <w:p>
@@ -204,7 +204,7 @@
           <w:b/>
           <w:sz w:val="24"/>
         </w:rPr>
-        <w:t>D3（5月xx日）返程</w:t>
+        <w:t>D3（5月xx日 周日）返程</w:t>
       </w:r>
     </w:p>
     <w:p>

</xml_diff>